<commit_message>
Practica 4: patas G/D/S del MOSFET IRLZ44N y opcion de fuente de 12 V
Co-Authored-By: Claude Opus 5.5 <noreply@anthropic.com>
</commit_message>
<xml_diff>
--- a/practica4-convertidores-pc817/guia-practica4/Practica4-Guia-Guiada.docx
+++ b/practica4-convertidores-pc817/guia-practica4/Practica4-Guia-Guiada.docx
@@ -340,6 +340,29 @@
           <w:sz w:val="22"/>
         </w:rPr>
         <w:t>trabajas con 24 V de CD. Arma y modifica SIEMPRE con las fuentes apagadas. Las masas de los dos lados (GND_ESP y GND_24 / GND_motor) NUNCA se unen: si las unes, el circuito sigue funcionando pero pierdes el aislamiento que protege a la ESP32-S3.</w:t>
+      </w:r>
+    </w:p>
+    <w:p>
+      <w:pPr>
+        <w:spacing w:before="0" w:after="60"/>
+      </w:pPr>
+      <w:r>
+        <w:rPr>
+          <w:b/>
+          <w:i w:val="0"/>
+          <w:color w:val="C9601F"/>
+          <w:sz w:val="22"/>
+        </w:rPr>
+        <w:t xml:space="preserve">¿No tienes fuente de 24 V?  </w:t>
+      </w:r>
+      <w:r>
+        <w:rPr>
+          <w:b w:val="0"/>
+          <w:i w:val="0"/>
+          <w:color w:val="1F2A3A"/>
+          <w:sz w:val="22"/>
+        </w:rPr>
+        <w:t>usa una de 12 V con las MISMAS resistencias: los tres circuitos funcionan (el Circuito 1 incluso satura con más margen). En toda la guía, donde diga 24 V lee 12 V, y anota en el Paso 2 qué fuente usaste.</w:t>
       </w:r>
     </w:p>
     <w:p>
@@ -622,6 +645,42 @@
                 <w:color w:val="1F2A3A"/>
                 <w:sz w:val="20"/>
               </w:rPr>
+              <w:t>IRLZ44N — patas (TO-220)</w:t>
+            </w:r>
+          </w:p>
+        </w:tc>
+        <w:tc>
+          <w:tcPr>
+            <w:tcW w:type="dxa" w:w="6192"/>
+          </w:tcPr>
+          <w:p>
+            <w:r/>
+            <w:r>
+              <w:rPr>
+                <w:b w:val="0"/>
+                <w:i w:val="0"/>
+                <w:color w:val="1F2A3A"/>
+                <w:sz w:val="20"/>
+              </w:rPr>
+              <w:t>Visto de frente (letras hacia ti, patas abajo): 1 = G (compuerta) · 2 = D (drenador) · 3 = S (fuente) · la pestaña metálica es D</w:t>
+            </w:r>
+          </w:p>
+        </w:tc>
+      </w:tr>
+      <w:tr>
+        <w:tc>
+          <w:tcPr>
+            <w:tcW w:type="dxa" w:w="3456"/>
+          </w:tcPr>
+          <w:p>
+            <w:r/>
+            <w:r>
+              <w:rPr>
+                <w:b/>
+                <w:i w:val="0"/>
+                <w:color w:val="1F2A3A"/>
+                <w:sz w:val="20"/>
+              </w:rPr>
               <w:t>Diodo de recirculación (flyback)</w:t>
             </w:r>
           </w:p>
@@ -711,7 +770,7 @@
                 <w:color w:val="1F2A3A"/>
                 <w:sz w:val="20"/>
               </w:rPr>
-              <w:t>ESP32-S3 DevKit + USB · fuente de 24 V · fuente de 5 V (separadas) · motorreductor TT 5 V · multímetro · osciloscopio · protoboard</w:t>
+              <w:t>ESP32-S3 DevKit + USB · fuente de 24 V (o de 12 V si no hay de 24 V) · fuente de 5 V (separadas) · motorreductor TT 5 V · multímetro · osciloscopio · protoboard</w:t>
             </w:r>
           </w:p>
         </w:tc>
@@ -1197,7 +1256,7 @@
           <w:color w:val="1F2A3A"/>
           <w:sz w:val="21"/>
         </w:rPr>
-        <w:t>con el LED encendido el colector baja a ≈ 0.2 V; con el LED apagado sube a 24 V (lógica invertida). En el peor caso real (GPIO bajo, V_F alto, calor) el margen cae a ≈ 0.84×: por eso mides en el Paso 3.</w:t>
+        <w:t>con el LED encendido el colector baja a ≈ 0.2 V; con el LED apagado sube a 24 V (lógica invertida). En el peor caso real (GPIO bajo, V_F alto, calor) el margen cae a ≈ 0.84×: por eso mides en el Paso 3. Con fuente de 12 V: I_C,nec = (12 − 0.2) / 10 kΩ = 1.18 mA → satura con margen 4×.</w:t>
       </w:r>
     </w:p>
     <w:p>
@@ -1439,7 +1498,7 @@
           <w:color w:val="1F2A3A"/>
           <w:sz w:val="21"/>
         </w:rPr>
-        <w:t>pata 4 (colector) → resistencia de 10 kΩ → +24 V. La pata 4 es la SALIDA.</w:t>
+        <w:t>pata 4 (colector) → resistencia de 10 kΩ → +24 V (o +12 V). La pata 4 es la SALIDA.</w:t>
       </w:r>
     </w:p>
     <w:p>
@@ -1510,6 +1569,20 @@
           <w:sz w:val="21"/>
         </w:rPr>
         <w:t>con el multímetro en continuidad, GND_ESP y GND_24 NO pitan entre sí.</w:t>
+      </w:r>
+    </w:p>
+    <w:p>
+      <w:pPr>
+        <w:spacing w:before="0" w:after="40"/>
+      </w:pPr>
+      <w:r>
+        <w:rPr>
+          <w:b/>
+          <w:i w:val="0"/>
+          <w:color w:val="1F2A3A"/>
+          <w:sz w:val="21"/>
+        </w:rPr>
+        <w:t>Fuente que usé en el lado de potencia:   ☐ 24 V     ☐ 12 V</w:t>
       </w:r>
     </w:p>
     <w:p>
@@ -1853,7 +1926,7 @@
           <w:color w:val="1F2A3A"/>
           <w:sz w:val="21"/>
         </w:rPr>
-        <w:t>LED apagado → ≈ 24 V; LED encendido → menos de 0.4 V. Si con el LED encendido mides más de 0.4 V, el PC817 no satura: cambia R_C a 22 kΩ (o R_in a 150 Ω), vuelve a medir y anótalo aquí:</w:t>
+        <w:t>LED apagado → ≈ 24 V (o ≈ 12 V); LED encendido → menos de 0.4 V. Si con el LED encendido mides más de 0.4 V, el PC817 no satura: cambia R_C a 22 kΩ (o R_in a 150 Ω), vuelve a medir y anótalo aquí:</w:t>
       </w:r>
     </w:p>
     <w:p>
@@ -2123,7 +2196,7 @@
                 <w:color w:val="1F2A3A"/>
                 <w:sz w:val="20"/>
               </w:rPr>
-              <w:t>I_F = (24 − V_F) / R_in</w:t>
+              <w:t>I_F = (V_entrada − V_F) / R_in   (V_entrada = 24 V o 12 V)</w:t>
             </w:r>
           </w:p>
         </w:tc>
@@ -2396,7 +2469,7 @@
           <w:color w:val="1F4E79"/>
           <w:sz w:val="22"/>
         </w:rPr>
-        <w:t>la potencia en R_in sale cerca de 0.1 W. Compra una resistencia de AL MENOS el doble de lo que calculas.</w:t>
+        <w:t>con 24 V la potencia en R_in sale cerca de 0.1 W (compra de AL MENOS el doble). Con 12 V: I_F ≈ 2.3 mA y P ≈ 0.025 W; la salida sigue saturando (necesita 0.31 mA y hay ≈ 1.15 mA disponibles).</w:t>
       </w:r>
     </w:p>
     <w:p>
@@ -3691,6 +3764,253 @@
     </w:p>
     <w:p>
       <w:pPr>
+        <w:spacing w:before="0" w:after="40"/>
+      </w:pPr>
+      <w:r>
+        <w:rPr>
+          <w:b/>
+          <w:i w:val="0"/>
+          <w:color w:val="1F4E79"/>
+          <w:sz w:val="21"/>
+        </w:rPr>
+        <w:t>Patas del MOSFET IRLZ44N (canal N, nivel lógico), visto de frente:</w:t>
+      </w:r>
+    </w:p>
+    <w:tbl>
+      <w:tblPr>
+        <w:tblStyle w:val="TableGrid"/>
+        <w:tblW w:type="auto" w:w="0"/>
+        <w:jc w:val="center"/>
+        <w:tblLook w:firstColumn="1" w:firstRow="1" w:lastColumn="0" w:lastRow="0" w:noHBand="0" w:noVBand="1" w:val="04A0"/>
+      </w:tblPr>
+      <w:tblGrid>
+        <w:gridCol w:w="3245"/>
+        <w:gridCol w:w="3245"/>
+        <w:gridCol w:w="3245"/>
+      </w:tblGrid>
+      <w:tr>
+        <w:tc>
+          <w:tcPr>
+            <w:tcW w:type="dxa" w:w="2160"/>
+            <w:shd w:val="clear" w:color="auto" w:fill="1F4E79"/>
+          </w:tcPr>
+          <w:p>
+            <w:r/>
+            <w:r>
+              <w:rPr>
+                <w:b/>
+                <w:i w:val="0"/>
+                <w:color w:val="FFFFFF"/>
+                <w:sz w:val="20"/>
+              </w:rPr>
+              <w:t>Pata</w:t>
+            </w:r>
+          </w:p>
+        </w:tc>
+        <w:tc>
+          <w:tcPr>
+            <w:tcW w:type="dxa" w:w="2736"/>
+            <w:shd w:val="clear" w:color="auto" w:fill="1F4E79"/>
+          </w:tcPr>
+          <w:p>
+            <w:r/>
+            <w:r>
+              <w:rPr>
+                <w:b/>
+                <w:i w:val="0"/>
+                <w:color w:val="FFFFFF"/>
+                <w:sz w:val="20"/>
+              </w:rPr>
+              <w:t>Terminal</w:t>
+            </w:r>
+          </w:p>
+        </w:tc>
+        <w:tc>
+          <w:tcPr>
+            <w:tcW w:type="dxa" w:w="4752"/>
+            <w:shd w:val="clear" w:color="auto" w:fill="1F4E79"/>
+          </w:tcPr>
+          <w:p>
+            <w:r/>
+            <w:r>
+              <w:rPr>
+                <w:b/>
+                <w:i w:val="0"/>
+                <w:color w:val="FFFFFF"/>
+                <w:sz w:val="20"/>
+              </w:rPr>
+              <w:t>Se conecta a</w:t>
+            </w:r>
+          </w:p>
+        </w:tc>
+      </w:tr>
+      <w:tr>
+        <w:tc>
+          <w:tcPr>
+            <w:tcW w:type="dxa" w:w="2160"/>
+          </w:tcPr>
+          <w:p>
+            <w:r/>
+            <w:r>
+              <w:rPr>
+                <w:b/>
+                <w:i w:val="0"/>
+                <w:color w:val="1F2A3A"/>
+                <w:sz w:val="20"/>
+              </w:rPr>
+              <w:t>1 (izquierda)</w:t>
+            </w:r>
+          </w:p>
+        </w:tc>
+        <w:tc>
+          <w:tcPr>
+            <w:tcW w:type="dxa" w:w="2736"/>
+          </w:tcPr>
+          <w:p>
+            <w:r/>
+            <w:r>
+              <w:rPr>
+                <w:b w:val="0"/>
+                <w:i w:val="0"/>
+                <w:color w:val="1F2A3A"/>
+                <w:sz w:val="20"/>
+              </w:rPr>
+              <w:t>G · compuerta (gate)</w:t>
+            </w:r>
+          </w:p>
+        </w:tc>
+        <w:tc>
+          <w:tcPr>
+            <w:tcW w:type="dxa" w:w="4752"/>
+          </w:tcPr>
+          <w:p>
+            <w:r/>
+            <w:r>
+              <w:rPr>
+                <w:b w:val="0"/>
+                <w:i w:val="0"/>
+                <w:color w:val="1F2A3A"/>
+                <w:sz w:val="20"/>
+              </w:rPr>
+              <w:t>colector del PC817 (pata 4) y la R_C de 10 kΩ a +5 V</w:t>
+            </w:r>
+          </w:p>
+        </w:tc>
+      </w:tr>
+      <w:tr>
+        <w:tc>
+          <w:tcPr>
+            <w:tcW w:type="dxa" w:w="2160"/>
+          </w:tcPr>
+          <w:p>
+            <w:r/>
+            <w:r>
+              <w:rPr>
+                <w:b/>
+                <w:i w:val="0"/>
+                <w:color w:val="1F2A3A"/>
+                <w:sz w:val="20"/>
+              </w:rPr>
+              <w:t>2 (centro) y pestaña</w:t>
+            </w:r>
+          </w:p>
+        </w:tc>
+        <w:tc>
+          <w:tcPr>
+            <w:tcW w:type="dxa" w:w="2736"/>
+          </w:tcPr>
+          <w:p>
+            <w:r/>
+            <w:r>
+              <w:rPr>
+                <w:b w:val="0"/>
+                <w:i w:val="0"/>
+                <w:color w:val="1F2A3A"/>
+                <w:sz w:val="20"/>
+              </w:rPr>
+              <w:t>D · drenador (drain)</w:t>
+            </w:r>
+          </w:p>
+        </w:tc>
+        <w:tc>
+          <w:tcPr>
+            <w:tcW w:type="dxa" w:w="4752"/>
+          </w:tcPr>
+          <w:p>
+            <w:r/>
+            <w:r>
+              <w:rPr>
+                <w:b w:val="0"/>
+                <w:i w:val="0"/>
+                <w:color w:val="1F2A3A"/>
+                <w:sz w:val="20"/>
+              </w:rPr>
+              <w:t>terminal (−) del motor y ánodo del diodo flyback</w:t>
+            </w:r>
+          </w:p>
+        </w:tc>
+      </w:tr>
+      <w:tr>
+        <w:tc>
+          <w:tcPr>
+            <w:tcW w:type="dxa" w:w="2160"/>
+          </w:tcPr>
+          <w:p>
+            <w:r/>
+            <w:r>
+              <w:rPr>
+                <w:b/>
+                <w:i w:val="0"/>
+                <w:color w:val="1F2A3A"/>
+                <w:sz w:val="20"/>
+              </w:rPr>
+              <w:t>3 (derecha)</w:t>
+            </w:r>
+          </w:p>
+        </w:tc>
+        <w:tc>
+          <w:tcPr>
+            <w:tcW w:type="dxa" w:w="2736"/>
+          </w:tcPr>
+          <w:p>
+            <w:r/>
+            <w:r>
+              <w:rPr>
+                <w:b w:val="0"/>
+                <w:i w:val="0"/>
+                <w:color w:val="1F2A3A"/>
+                <w:sz w:val="20"/>
+              </w:rPr>
+              <w:t>S · fuente (source)</w:t>
+            </w:r>
+          </w:p>
+        </w:tc>
+        <w:tc>
+          <w:tcPr>
+            <w:tcW w:type="dxa" w:w="4752"/>
+          </w:tcPr>
+          <w:p>
+            <w:r/>
+            <w:r>
+              <w:rPr>
+                <w:b w:val="0"/>
+                <w:i w:val="0"/>
+                <w:color w:val="1F2A3A"/>
+                <w:sz w:val="20"/>
+              </w:rPr>
+              <w:t>GND_motor (tierra de la fuente de 5 V)</w:t>
+            </w:r>
+          </w:p>
+        </w:tc>
+      </w:tr>
+    </w:tbl>
+    <w:p>
+      <w:pPr>
+        <w:spacing w:before="0" w:after="40"/>
+      </w:pPr>
+    </w:p>
+    <w:p>
+      <w:pPr>
         <w:spacing w:before="0" w:after="60"/>
       </w:pPr>
       <w:r>

</xml_diff>